<commit_message>
Fix contract slot matching, make documents strictly B&W with justified equal-width lines
</commit_message>
<xml_diff>
--- a/backend/app/data/contracts/01_სერტიფიკაციის_სქემა.docx
+++ b/backend/app/data/contracts/01_სერტიფიკაციის_სქემა.docx
@@ -68,7 +68,6 @@
         <w:tc>
           <w:tcPr>
             <w:tcW w:type="dxa" w:w="2698"/>
-            <w:shd w:val="clear" w:color="auto" w:fill="F2F2F2"/>
             <w:vAlign w:val="center"/>
           </w:tcPr>
           <w:p>
@@ -118,7 +117,6 @@
         <w:tc>
           <w:tcPr>
             <w:tcW w:type="dxa" w:w="2698"/>
-            <w:shd w:val="clear" w:color="auto" w:fill="F2F2F2"/>
             <w:vAlign w:val="center"/>
           </w:tcPr>
           <w:p>
@@ -168,7 +166,6 @@
         <w:tc>
           <w:tcPr>
             <w:tcW w:type="dxa" w:w="2698"/>
-            <w:shd w:val="clear" w:color="auto" w:fill="F2F2F2"/>
             <w:vAlign w:val="center"/>
           </w:tcPr>
           <w:p>
@@ -218,7 +215,6 @@
         <w:tc>
           <w:tcPr>
             <w:tcW w:type="dxa" w:w="2698"/>
-            <w:shd w:val="clear" w:color="auto" w:fill="F2F2F2"/>
             <w:vAlign w:val="center"/>
           </w:tcPr>
           <w:p>
@@ -1390,7 +1386,7 @@
           <w:color w:val="000000"/>
           <w:sz w:val="21"/>
         </w:rPr>
-        <w:t>ბ) გარემოს კონტროლი და შენობის მიკროკლიმატი;</w:t>
+        <w:t>ბ) გარემოს კონტროლი, შენობის მიკროკლიმატი და ენერგოეფექტურობა (საქართველოს კანონი „ენერგოეფექტურობის შესახებ“; დადგენილება №354);</w:t>
       </w:r>
     </w:p>
     <w:p>
@@ -1438,7 +1434,7 @@
           <w:color w:val="000000"/>
           <w:sz w:val="21"/>
         </w:rPr>
-        <w:t>ე) შენობის ღირებულების შეფასების პრინციპები.</w:t>
+        <w:t>ე) შენობის ღირებულების შეფასების პრინციპები (დადგენილება №241).</w:t>
       </w:r>
     </w:p>
     <w:p>
@@ -2338,7 +2334,7 @@
           <w:color w:val="000000"/>
           <w:sz w:val="21"/>
         </w:rPr>
-        <w:t>ეტაპი II — პრაქტიკული: მრავალბინიანი საცხოვრებელი სახლის პროექტი (30 წუთი):</w:t>
+        <w:t>ეტაპი II — პრაქტიკული: მრავალბინიანი, მრავალსართულიანი საცხოვრებელი სახლის არქიტექტურული პროექტი (30 წუთი):</w:t>
       </w:r>
       <w:r>
         <w:rPr>
@@ -2348,7 +2344,7 @@
           <w:color w:val="000000"/>
           <w:sz w:val="21"/>
         </w:rPr>
-        <w:t xml:space="preserve"> მრავალბინიანი საცხოვრებელი სახლის არქიტექტურულ პროექტში განზრახ დაშვებული ნორმატიული და ტექნიკური შეცდომების იდენტიფიცირება;</w:t>
+        <w:t xml:space="preserve"> მრავალბინიანი, მრავალსართულიანი საცხოვრებელი სახლის არქიტექტურულ პროექტში განზრახ დაშვებული ნორმატიული და ტექნიკური შეცდომების იდენტიფიცირება;</w:t>
       </w:r>
     </w:p>
     <w:p>
@@ -2400,7 +2396,7 @@
           <w:color w:val="000000"/>
           <w:sz w:val="21"/>
         </w:rPr>
-        <w:t>ეტაპი III — პრაქტიკული: საჯარო ან საზოგადოებრივი დანიშნულების შენობის პროექტი (30 წუთი):</w:t>
+        <w:t>ეტაპი III — პრაქტიკული: საჯარო ან საზოგადოებრივი დანიშნულების შენობის არქიტექტურული პროექტი (30 წუთი):</w:t>
       </w:r>
       <w:r>
         <w:rPr>
@@ -2469,7 +2465,7 @@
           <w:color w:val="000000"/>
           <w:sz w:val="21"/>
         </w:rPr>
-        <w:t>7 (შვიდ) ნორმატიულ აქტს</w:t>
+        <w:t>10 (ათ) ნორმატიულ აქტს</w:t>
       </w:r>
       <w:r>
         <w:rPr>
@@ -2517,7 +2513,6 @@
         <w:tc>
           <w:tcPr>
             <w:tcW w:type="dxa" w:w="480"/>
-            <w:shd w:val="clear" w:color="auto" w:fill="F2F2F2"/>
             <w:vAlign w:val="center"/>
           </w:tcPr>
           <w:p>
@@ -2540,7 +2535,6 @@
         <w:tc>
           <w:tcPr>
             <w:tcW w:type="dxa" w:w="2645"/>
-            <w:shd w:val="clear" w:color="auto" w:fill="F2F2F2"/>
             <w:vAlign w:val="center"/>
           </w:tcPr>
           <w:p>
@@ -2563,7 +2557,6 @@
         <w:tc>
           <w:tcPr>
             <w:tcW w:type="dxa" w:w="3273"/>
-            <w:shd w:val="clear" w:color="auto" w:fill="F2F2F2"/>
             <w:vAlign w:val="center"/>
           </w:tcPr>
           <w:p>
@@ -2586,7 +2579,6 @@
         <w:tc>
           <w:tcPr>
             <w:tcW w:type="dxa" w:w="3241"/>
-            <w:shd w:val="clear" w:color="auto" w:fill="F2F2F2"/>
             <w:vAlign w:val="center"/>
           </w:tcPr>
           <w:p>
@@ -3258,6 +3250,285 @@
           </w:p>
         </w:tc>
       </w:tr>
+      <w:tr>
+        <w:trPr>
+          <w:cantSplit/>
+        </w:trPr>
+        <w:tc>
+          <w:tcPr>
+            <w:tcW w:type="dxa" w:w="480"/>
+            <w:vAlign w:val="center"/>
+          </w:tcPr>
+          <w:p>
+            <w:pPr>
+              <w:spacing w:before="20" w:after="20" w:line="264" w:lineRule="auto"/>
+              <w:jc w:val="left"/>
+            </w:pPr>
+            <w:r>
+              <w:rPr>
+                <w:rFonts w:ascii="Sylfaen" w:hAnsi="Sylfaen" w:cs="Sylfaen" w:eastAsia="Sylfaen"/>
+                <w:b w:val="0"/>
+                <w:i w:val="0"/>
+                <w:color w:val="000000"/>
+                <w:sz w:val="20"/>
+              </w:rPr>
+              <w:t>8</w:t>
+            </w:r>
+          </w:p>
+        </w:tc>
+        <w:tc>
+          <w:tcPr>
+            <w:tcW w:type="dxa" w:w="2645"/>
+            <w:vAlign w:val="center"/>
+          </w:tcPr>
+          <w:p>
+            <w:pPr>
+              <w:spacing w:before="20" w:after="20" w:line="264" w:lineRule="auto"/>
+              <w:jc w:val="left"/>
+            </w:pPr>
+            <w:r>
+              <w:rPr>
+                <w:rFonts w:ascii="Sylfaen" w:hAnsi="Sylfaen" w:cs="Sylfaen" w:eastAsia="Sylfaen"/>
+                <w:b w:val="0"/>
+                <w:i w:val="0"/>
+                <w:color w:val="000000"/>
+                <w:sz w:val="20"/>
+              </w:rPr>
+              <w:t>საქართველოს 2020 წლის 21 მაისის კანონი</w:t>
+            </w:r>
+          </w:p>
+        </w:tc>
+        <w:tc>
+          <w:tcPr>
+            <w:tcW w:type="dxa" w:w="3273"/>
+            <w:vAlign w:val="center"/>
+          </w:tcPr>
+          <w:p>
+            <w:pPr>
+              <w:spacing w:before="20" w:after="20" w:line="264" w:lineRule="auto"/>
+              <w:jc w:val="left"/>
+            </w:pPr>
+            <w:r>
+              <w:rPr>
+                <w:rFonts w:ascii="Sylfaen" w:hAnsi="Sylfaen" w:cs="Sylfaen" w:eastAsia="Sylfaen"/>
+                <w:b w:val="0"/>
+                <w:i w:val="0"/>
+                <w:color w:val="000000"/>
+                <w:sz w:val="20"/>
+              </w:rPr>
+              <w:t>ენერგოეფექტურობის შესახებ</w:t>
+            </w:r>
+          </w:p>
+        </w:tc>
+        <w:tc>
+          <w:tcPr>
+            <w:tcW w:type="dxa" w:w="3241"/>
+            <w:vAlign w:val="center"/>
+          </w:tcPr>
+          <w:p>
+            <w:pPr>
+              <w:spacing w:before="20" w:after="20" w:line="264" w:lineRule="auto"/>
+              <w:jc w:val="left"/>
+            </w:pPr>
+            <w:r>
+              <w:rPr>
+                <w:rFonts w:ascii="Sylfaen" w:hAnsi="Sylfaen" w:cs="Sylfaen" w:eastAsia="Sylfaen"/>
+                <w:b w:val="0"/>
+                <w:i w:val="0"/>
+                <w:color w:val="000000"/>
+                <w:sz w:val="20"/>
+              </w:rPr>
+              <w:t>მაცნე — ენერგოეფექტურობა</w:t>
+            </w:r>
+          </w:p>
+        </w:tc>
+      </w:tr>
+      <w:tr>
+        <w:trPr>
+          <w:cantSplit/>
+        </w:trPr>
+        <w:tc>
+          <w:tcPr>
+            <w:tcW w:type="dxa" w:w="480"/>
+            <w:vAlign w:val="center"/>
+          </w:tcPr>
+          <w:p>
+            <w:pPr>
+              <w:spacing w:before="20" w:after="20" w:line="264" w:lineRule="auto"/>
+              <w:jc w:val="left"/>
+            </w:pPr>
+            <w:r>
+              <w:rPr>
+                <w:rFonts w:ascii="Sylfaen" w:hAnsi="Sylfaen" w:cs="Sylfaen" w:eastAsia="Sylfaen"/>
+                <w:b w:val="0"/>
+                <w:i w:val="0"/>
+                <w:color w:val="000000"/>
+                <w:sz w:val="20"/>
+              </w:rPr>
+              <w:t>9</w:t>
+            </w:r>
+          </w:p>
+        </w:tc>
+        <w:tc>
+          <w:tcPr>
+            <w:tcW w:type="dxa" w:w="2645"/>
+            <w:vAlign w:val="center"/>
+          </w:tcPr>
+          <w:p>
+            <w:pPr>
+              <w:spacing w:before="20" w:after="20" w:line="264" w:lineRule="auto"/>
+              <w:jc w:val="left"/>
+            </w:pPr>
+            <w:r>
+              <w:rPr>
+                <w:rFonts w:ascii="Sylfaen" w:hAnsi="Sylfaen" w:cs="Sylfaen" w:eastAsia="Sylfaen"/>
+                <w:b w:val="0"/>
+                <w:i w:val="0"/>
+                <w:color w:val="000000"/>
+                <w:sz w:val="20"/>
+              </w:rPr>
+              <w:t>საქართველოს მთავრობის 2021 წლის 13 ივლისის №354 დადგენილება</w:t>
+            </w:r>
+          </w:p>
+        </w:tc>
+        <w:tc>
+          <w:tcPr>
+            <w:tcW w:type="dxa" w:w="3273"/>
+            <w:vAlign w:val="center"/>
+          </w:tcPr>
+          <w:p>
+            <w:pPr>
+              <w:spacing w:before="20" w:after="20" w:line="264" w:lineRule="auto"/>
+              <w:jc w:val="left"/>
+            </w:pPr>
+            <w:r>
+              <w:rPr>
+                <w:rFonts w:ascii="Sylfaen" w:hAnsi="Sylfaen" w:cs="Sylfaen" w:eastAsia="Sylfaen"/>
+                <w:b w:val="0"/>
+                <w:i w:val="0"/>
+                <w:color w:val="000000"/>
+                <w:sz w:val="20"/>
+              </w:rPr>
+              <w:t>შენობების, შენობების ნაწილების ან შენობების ელემენტების ენერგოეფექტურობის მინიმალური მოთხოვნების დამტკიცების შესახებ</w:t>
+            </w:r>
+          </w:p>
+        </w:tc>
+        <w:tc>
+          <w:tcPr>
+            <w:tcW w:type="dxa" w:w="3241"/>
+            <w:vAlign w:val="center"/>
+          </w:tcPr>
+          <w:p>
+            <w:pPr>
+              <w:spacing w:before="20" w:after="20" w:line="264" w:lineRule="auto"/>
+              <w:jc w:val="left"/>
+            </w:pPr>
+            <w:r>
+              <w:rPr>
+                <w:rFonts w:ascii="Sylfaen" w:hAnsi="Sylfaen" w:cs="Sylfaen" w:eastAsia="Sylfaen"/>
+                <w:b w:val="0"/>
+                <w:i w:val="0"/>
+                <w:color w:val="000000"/>
+                <w:sz w:val="20"/>
+              </w:rPr>
+              <w:t>მაცნე — №354</w:t>
+            </w:r>
+          </w:p>
+        </w:tc>
+      </w:tr>
+      <w:tr>
+        <w:trPr>
+          <w:cantSplit/>
+        </w:trPr>
+        <w:tc>
+          <w:tcPr>
+            <w:tcW w:type="dxa" w:w="480"/>
+            <w:vAlign w:val="center"/>
+          </w:tcPr>
+          <w:p>
+            <w:pPr>
+              <w:spacing w:before="20" w:after="20" w:line="264" w:lineRule="auto"/>
+              <w:jc w:val="left"/>
+            </w:pPr>
+            <w:r>
+              <w:rPr>
+                <w:rFonts w:ascii="Sylfaen" w:hAnsi="Sylfaen" w:cs="Sylfaen" w:eastAsia="Sylfaen"/>
+                <w:b w:val="0"/>
+                <w:i w:val="0"/>
+                <w:color w:val="000000"/>
+                <w:sz w:val="20"/>
+              </w:rPr>
+              <w:t>10</w:t>
+            </w:r>
+          </w:p>
+        </w:tc>
+        <w:tc>
+          <w:tcPr>
+            <w:tcW w:type="dxa" w:w="2645"/>
+            <w:vAlign w:val="center"/>
+          </w:tcPr>
+          <w:p>
+            <w:pPr>
+              <w:spacing w:before="20" w:after="20" w:line="264" w:lineRule="auto"/>
+              <w:jc w:val="left"/>
+            </w:pPr>
+            <w:r>
+              <w:rPr>
+                <w:rFonts w:ascii="Sylfaen" w:hAnsi="Sylfaen" w:cs="Sylfaen" w:eastAsia="Sylfaen"/>
+                <w:b w:val="0"/>
+                <w:i w:val="0"/>
+                <w:color w:val="000000"/>
+                <w:sz w:val="20"/>
+              </w:rPr>
+              <w:t>საქართველოს მთავრობის 2026 წლის 1 ივნისის №241 დადგენილება</w:t>
+            </w:r>
+          </w:p>
+        </w:tc>
+        <w:tc>
+          <w:tcPr>
+            <w:tcW w:type="dxa" w:w="3273"/>
+            <w:vAlign w:val="center"/>
+          </w:tcPr>
+          <w:p>
+            <w:pPr>
+              <w:spacing w:before="20" w:after="20" w:line="264" w:lineRule="auto"/>
+              <w:jc w:val="left"/>
+            </w:pPr>
+            <w:r>
+              <w:rPr>
+                <w:rFonts w:ascii="Sylfaen" w:hAnsi="Sylfaen" w:cs="Sylfaen" w:eastAsia="Sylfaen"/>
+                <w:b w:val="0"/>
+                <w:i w:val="0"/>
+                <w:color w:val="000000"/>
+                <w:sz w:val="20"/>
+              </w:rPr>
+              <w:t>ტექნიკური რეგლამენტის − სამშენებლო სამუშაოების სახელმწიფო შესყიდვისას ზედნადები ხარჯების, გეგმური მოგებისა და სხვა დანარიცხების განსაზღვრის წესის დამტკიცების შესახებ</w:t>
+            </w:r>
+          </w:p>
+        </w:tc>
+        <w:tc>
+          <w:tcPr>
+            <w:tcW w:type="dxa" w:w="3241"/>
+            <w:vAlign w:val="center"/>
+          </w:tcPr>
+          <w:p>
+            <w:pPr>
+              <w:spacing w:before="20" w:after="20" w:line="264" w:lineRule="auto"/>
+              <w:jc w:val="left"/>
+            </w:pPr>
+            <w:r>
+              <w:rPr>
+                <w:rFonts w:ascii="Sylfaen" w:hAnsi="Sylfaen" w:cs="Sylfaen" w:eastAsia="Sylfaen"/>
+                <w:b w:val="0"/>
+                <w:i w:val="0"/>
+                <w:color w:val="000000"/>
+                <w:sz w:val="20"/>
+              </w:rPr>
+              <w:t>მაცნე — №241</w:t>
+            </w:r>
+          </w:p>
+        </w:tc>
+      </w:tr>
     </w:tbl>
     <w:p>
       <w:pPr>
@@ -3540,7 +3811,6 @@
         <w:tc>
           <w:tcPr>
             <w:tcW w:type="dxa" w:w="1303"/>
-            <w:shd w:val="clear" w:color="auto" w:fill="F2F2F2"/>
             <w:vAlign w:val="center"/>
           </w:tcPr>
           <w:p>
@@ -3563,7 +3833,6 @@
         <w:tc>
           <w:tcPr>
             <w:tcW w:type="dxa" w:w="5660"/>
-            <w:shd w:val="clear" w:color="auto" w:fill="F2F2F2"/>
             <w:vAlign w:val="center"/>
           </w:tcPr>
           <w:p>
@@ -3586,7 +3855,6 @@
         <w:tc>
           <w:tcPr>
             <w:tcW w:type="dxa" w:w="2676"/>
-            <w:shd w:val="clear" w:color="auto" w:fill="F2F2F2"/>
             <w:vAlign w:val="center"/>
           </w:tcPr>
           <w:p>
@@ -4148,7 +4416,7 @@
                 <w:color w:val="000000"/>
                 <w:sz w:val="20"/>
               </w:rPr>
-              <w:t>გარემო</w:t>
+              <w:t>გარემო (საქართველოს კანონი „ენერგოეფექტურობის შესახებ“; დადგენილება №354)</w:t>
             </w:r>
           </w:p>
         </w:tc>
@@ -4361,7 +4629,7 @@
                 <w:color w:val="000000"/>
                 <w:sz w:val="20"/>
               </w:rPr>
-              <w:t>შენობის ღირებულების შეფასება</w:t>
+              <w:t>შენობის ღირებულების შეფასება (დადგენილება №241)</w:t>
             </w:r>
           </w:p>
         </w:tc>
@@ -5075,7 +5343,7 @@
           <w:color w:val="000000"/>
           <w:sz w:val="22"/>
         </w:rPr>
-        <w:t>5.4 ეტაპი II: პრაქტიკული — ქ. თბილისში მრავალბინიანი საცხოვრებელი სახლის პროექტი</w:t>
+        <w:t>5.4 ეტაპი II: პრაქტიკული — მრავალბინიანი, მრავალსართულიანი საცხოვრებელი სახლის არქიტექტურული პროექტი</w:t>
       </w:r>
     </w:p>
     <w:p>
@@ -5118,7 +5386,7 @@
           <w:color w:val="000000"/>
           <w:sz w:val="21"/>
         </w:rPr>
-        <w:t>„ქ. თბილისში მრავალბინიანი საცხოვრებელი სახლის პროექტი“</w:t>
+        <w:t>„მრავალბინიანი, მრავალსართულიანი საცხოვრებელი სახლის არქიტექტურული პროექტი“</w:t>
       </w:r>
       <w:r>
         <w:rPr>
@@ -5194,7 +5462,7 @@
           <w:color w:val="000000"/>
           <w:sz w:val="21"/>
         </w:rPr>
-        <w:t>საგამოცდო პროექტი (ან პროექტის ნაწილი), დავალების სპეციფიკის შესაბამისად, მოიცავს შესაფასებლად აუცილებელ არქიტექტურულ ნახაზებსა და მონაცემებს (მაგალითად: მიწის ნაკვეთის გეგმას, სართულების გეგმებს, ჭრილებს, ფასადებს ან/და არქიტექტურულ დეტალებსა და კვანძებს).</w:t>
+        <w:t>№134 დადგენილების დანართი №1-ის შესაბამისად, საგამოცდო პროექტი მინიმუმ მოიცავს შემდეგ ნაწილებს: 1) მიწის ნაკვეთის გეგმა; 2) გეგმები, ჭრილები, ფასადები; 3) დეტალები.</w:t>
       </w:r>
     </w:p>
     <w:p>
@@ -5211,7 +5479,7 @@
           <w:color w:val="000000"/>
           <w:sz w:val="22"/>
         </w:rPr>
-        <w:t>5.5 ეტაპი III: პრაქტიკული — საჯარო ან საზოგადოებრივი დანიშნულების შენობის პროექტი</w:t>
+        <w:t>5.5 ეტაპი III: პრაქტიკული — საჯარო ან საზოგადოებრივი დანიშნულების შენობის არქიტექტურული პროექტი</w:t>
       </w:r>
     </w:p>
     <w:p>
@@ -5254,7 +5522,7 @@
           <w:color w:val="000000"/>
           <w:sz w:val="21"/>
         </w:rPr>
-        <w:t>„საჯარო ან საზოგადოებრივი დანიშნულების შენობის პროექტი“</w:t>
+        <w:t>„საჯარო ან საზოგადოებრივი დანიშნულების შენობის არქიტექტურული პროექტი“</w:t>
       </w:r>
       <w:r>
         <w:rPr>
@@ -5330,7 +5598,7 @@
           <w:color w:val="000000"/>
           <w:sz w:val="21"/>
         </w:rPr>
-        <w:t>საგამოცდო პროექტი (ან პროექტის ნაწილი), დავალების სპეციფიკის შესაბამისად, მოიცავს შესაფასებლად აუცილებელ არქიტექტურულ ნახაზებსა და მონაცემებს (მაგალითად: მიწის ნაკვეთის გეგმას, სართულების გეგმებს, ჭრილებს, ფასადებს ან/და არქიტექტურულ დეტალებსა და კვანძებს).</w:t>
+        <w:t>№134 დადგენილების დანართი №1-ის შესაბამისად, საგამოცდო პროექტი მინიმუმ მოიცავს შემდეგ ნაწილებს: 1) მიწის ნაკვეთის გეგმა; 2) გეგმები, ჭრილები, ფასადები; 3) დეტალები.</w:t>
       </w:r>
     </w:p>
     <w:p>
@@ -5373,7 +5641,7 @@
           <w:color w:val="000000"/>
           <w:sz w:val="21"/>
         </w:rPr>
-        <w:t>„ქ. თბილისში მრავალბინიანი საცხოვრებელი სახლის პროექტი“</w:t>
+        <w:t>„მრავალბინიანი, მრავალსართულიანი საცხოვრებელი სახლის არქიტექტურული პროექტი“</w:t>
       </w:r>
       <w:r>
         <w:rPr>
@@ -5393,7 +5661,7 @@
           <w:color w:val="000000"/>
           <w:sz w:val="21"/>
         </w:rPr>
-        <w:t>„საჯარო ან საზოგადოებრივი დანიშნულების შენობის პროექტი“</w:t>
+        <w:t>„საჯარო ან საზოგადოებრივი დანიშნულების შენობის არქიტექტურული პროექტი“</w:t>
       </w:r>
       <w:r>
         <w:rPr>
@@ -5707,7 +5975,6 @@
         <w:tc>
           <w:tcPr>
             <w:tcW w:type="dxa" w:w="2342"/>
-            <w:shd w:val="clear" w:color="auto" w:fill="F2F2F2"/>
             <w:vAlign w:val="center"/>
           </w:tcPr>
           <w:p>
@@ -5730,7 +5997,6 @@
         <w:tc>
           <w:tcPr>
             <w:tcW w:type="dxa" w:w="2438"/>
-            <w:shd w:val="clear" w:color="auto" w:fill="F2F2F2"/>
             <w:vAlign w:val="center"/>
           </w:tcPr>
           <w:p>
@@ -5753,7 +6019,6 @@
         <w:tc>
           <w:tcPr>
             <w:tcW w:type="dxa" w:w="2438"/>
-            <w:shd w:val="clear" w:color="auto" w:fill="F2F2F2"/>
             <w:vAlign w:val="center"/>
           </w:tcPr>
           <w:p>
@@ -5776,7 +6041,6 @@
         <w:tc>
           <w:tcPr>
             <w:tcW w:type="dxa" w:w="2421"/>
-            <w:shd w:val="clear" w:color="auto" w:fill="F2F2F2"/>
             <w:vAlign w:val="center"/>
           </w:tcPr>
           <w:p>

</xml_diff>

<commit_message>
Sync all doc 2 accreditation documents, add transitional contracts (08a, 09b), and update AI knowledge base
</commit_message>
<xml_diff>
--- a/backend/app/data/contracts/01_სერტიფიკაციის_სქემა.docx
+++ b/backend/app/data/contracts/01_სერტიფიკაციის_სქემა.docx
@@ -642,7 +642,7 @@
           <w:color w:val="000000"/>
           <w:sz w:val="21"/>
         </w:rPr>
-        <w:t xml:space="preserve"> საქართველოს მთავრობის №134 დადგენილებით დამტკიცებული წესის მე-7 მუხლის შესაბამისად, წინამდებარე წესით განსაზღვრული სერტიფიცირების სავალდებულო მოთხოვნა არ ვრცელდება V კლასის (განსაკუთრებული მნიშვნელობის) შენობა-ნაგებობებსა და კულტურული მემკვიდრეობის ძეგლებზე.</w:t>
+        <w:t xml:space="preserve"> სერტიფიცირების სავალდებულო მოთხოვნიდან გამონაკლისები — მათ შორის, V კლასის (განსაკუთრებული მნიშვნელობის) შენობა-ნაგებობებსა და კულტურული მემკვიდრეობის უძრავ ძეგლებზე (დადგენილების მე-7 მუხლი), საერთაშორისო საფინანსო ინსტიტუტების მიერ დაფინანსებულ პროექტებსა და ევროკავშირის/OECD-ის წევრ ქვეყნებში ავტორიზებულ პირებზე (დადგენილების მე-3 მუხლი), აგრეთვე 2026 წლის 1 სექტემბრამდე შეთანხმებული პროექტების კორექტირებაზე (დადგენილების მე-6 მუხლი) — განისაზღვრება საქართველოს მთავრობის 2024 წლის 10 აპრილის №134 დადგენილებითა და მოქმედი კანონმდებლობით.</w:t>
       </w:r>
     </w:p>
     <w:p>
@@ -879,7 +879,7 @@
           <w:color w:val="000000"/>
           <w:sz w:val="21"/>
         </w:rPr>
-        <w:t xml:space="preserve"> 2029 წლის 1 იანვრამდე A და B კატეგორიების სასერტიფიკაციო გამოცდაზე დაიშვებიან პირები უმაღლესი არქიტექტურული განათლების (აკადემიური ხარისხის) მოთხოვნის გარეშე, თუ მათ გააჩნიათ სპეციალობით მუშაობის არანაკლებ 3 წლის გამოცდილება, მათ შორის ბოლო 2 წლის უწყვეტი პრაქტიკა (№134 დადგენილებით დამტკიცებული წესის მე-4 მუხლის მე-4 პუნქტის „ბ“ ქვეპუნქტი და მე-12 მუხლის პირველი პუნქტი). აღნიშნული შეღავათი C კატეგორიაზე არ ვრცელდება;</w:t>
+        <w:t xml:space="preserve"> 2029 წლის 1 იანვრამდე (ან კანონმდებლობით ამ ვადის გადაწევის შემთხვევაში — შესაბამის ახალ თარიღამდე) A და B კატეგორიების სასერტიფიკაციო გამოცდაზე დაიშვებიან პირები უმაღლესი არქიტექტურული განათლების (აკადემიური ხარისხის) მოთხოვნის გარეშე (მათ შორის, B კატეგორიაზე — მშენებლობის ნებართვის გამცემ ადმინისტრაციულ ორგანოში მომუშავე სანებართვო დოკუმენტაციის შემსწავლელი სპეციალისტები და №134 დადგენილებით დამტკიცებული წესის მე-12 მუხლის პირველი პუნქტით გათვალისწინებული სხვა უფლებამოსილი პირები), თუ მათ გააჩნიათ სპეციალობით მუშაობის არანაკლებ 3 წლის გამოცდილება, მათ შორის ბოლო 2 წლის უწყვეტი პრაქტიკა (№134 დადგენილებით დამტკიცებული წესის მე-4 მუხლის მე-4 პუნქტის „ბ“ ქვეპუნქტი და მე-12 მუხლის პირველი პუნქტი). აღნიშნული შეღავათი C კატეგორიაზე არ ვრცელდება;</w:t>
       </w:r>
     </w:p>
     <w:p>
@@ -905,7 +905,7 @@
           <w:color w:val="000000"/>
           <w:sz w:val="21"/>
         </w:rPr>
-        <w:t>სერტიფიკატის მოქმედების ვადა:</w:t>
+        <w:t>სერტიფიკატის მოქმედების საგამონაკლისო რეჟიმი (ორმაგი ვადის დათქმა):</w:t>
       </w:r>
       <w:r>
         <w:rPr>
@@ -915,7 +915,7 @@
           <w:color w:val="000000"/>
           <w:sz w:val="21"/>
         </w:rPr>
-        <w:t xml:space="preserve"> გარდამავალი პირობით (აკადემიური ხარისხის გარეშე) გაცემული A და B კატეგორიის სერტიფიკატი მოქმედებს </w:t>
+        <w:t xml:space="preserve"> გარდამავალი წესით (უმაღლესი არქიტექტურული განათლების დიპლომის წარმოდგენის გარეშე) სერტიფიცირებულ პირთან ფორმდება შესაბამისი საგამონაკლისო/გარდამავალი სასერტიფიკაციო ხელშეკრულება (</w:t>
       </w:r>
       <w:r>
         <w:rPr>
@@ -925,7 +925,7 @@
           <w:color w:val="000000"/>
           <w:sz w:val="21"/>
         </w:rPr>
-        <w:t>2029 წლის 1 იანვრამდე</w:t>
+        <w:t>GIPC-CON-001 (გარდამავალი)</w:t>
       </w:r>
       <w:r>
         <w:rPr>
@@ -935,7 +935,67 @@
           <w:color w:val="000000"/>
           <w:sz w:val="21"/>
         </w:rPr>
-        <w:t>;</w:t>
+        <w:t xml:space="preserve"> ან </w:t>
+      </w:r>
+      <w:r>
+        <w:rPr>
+          <w:rFonts w:ascii="Sylfaen" w:hAnsi="Sylfaen" w:cs="Sylfaen" w:eastAsia="Sylfaen"/>
+          <w:b/>
+          <w:i w:val="0"/>
+          <w:color w:val="000000"/>
+          <w:sz w:val="21"/>
+        </w:rPr>
+        <w:t>GIPC-CON-002 (გარდამავალი)</w:t>
+      </w:r>
+      <w:r>
+        <w:rPr>
+          <w:rFonts w:ascii="Sylfaen" w:hAnsi="Sylfaen" w:cs="Sylfaen" w:eastAsia="Sylfaen"/>
+          <w:b w:val="0"/>
+          <w:i w:val="0"/>
+          <w:color w:val="000000"/>
+          <w:sz w:val="21"/>
+        </w:rPr>
+        <w:t>) და გაიცემა სტანდარტული ფორმის სერტიფიკატი (5-წლიანი სასერტიფიკაციო ციკლით — წესის მე-2 მუხლის მე-3 პუნქტი) იმ სავალდებულო სახელშეკრულებო პირობით, რომ პირი კანონმდებლობით დადგენილი გარდამავალი ვადის (</w:t>
+      </w:r>
+      <w:r>
+        <w:rPr>
+          <w:rFonts w:ascii="Sylfaen" w:hAnsi="Sylfaen" w:cs="Sylfaen" w:eastAsia="Sylfaen"/>
+          <w:b/>
+          <w:i w:val="0"/>
+          <w:color w:val="000000"/>
+          <w:sz w:val="21"/>
+        </w:rPr>
+        <w:t>2029 წლის 1 იანვარი</w:t>
+      </w:r>
+      <w:r>
+        <w:rPr>
+          <w:rFonts w:ascii="Sylfaen" w:hAnsi="Sylfaen" w:cs="Sylfaen" w:eastAsia="Sylfaen"/>
+          <w:b w:val="0"/>
+          <w:i w:val="0"/>
+          <w:color w:val="000000"/>
+          <w:sz w:val="21"/>
+        </w:rPr>
+        <w:t xml:space="preserve">, ხოლო სახელმწიფოს მიერ ვადის ოფიციალურად გადაწევის შემთხვევაში — ახალი საკანონმდებლო თარიღი) ამოწურვამდე წარადგენს უმაღლესი არქიტექტურული განათლების დიპლომს. დიპლომის გარდამავალ ვადამდე წარდგენისას სერტიფიკატს ეხსნება საგამონაკლისო შეზღუდვა და იგი უწყვეტად აგრძელებს მოქმედებას სრული 5-წლიანი ციკლის ამოწურვამდე (დამატებითი გამოცდისა და საფასურის გარეშე), ხოლო დიპლომის წარუდგენლობის შემთხვევაში გარდამავალი თარიღის დადგომისთანავე იწურება სერტიფიკატის მოქმედების საგამონაკლისო ვადა და სერტიფიკატი </w:t>
+      </w:r>
+      <w:r>
+        <w:rPr>
+          <w:rFonts w:ascii="Sylfaen" w:hAnsi="Sylfaen" w:cs="Sylfaen" w:eastAsia="Sylfaen"/>
+          <w:b/>
+          <w:i w:val="0"/>
+          <w:color w:val="000000"/>
+          <w:sz w:val="21"/>
+        </w:rPr>
+        <w:t>gipc.org.ge</w:t>
+      </w:r>
+      <w:r>
+        <w:rPr>
+          <w:rFonts w:ascii="Sylfaen" w:hAnsi="Sylfaen" w:cs="Sylfaen" w:eastAsia="Sylfaen"/>
+          <w:b w:val="0"/>
+          <w:i w:val="0"/>
+          <w:color w:val="000000"/>
+          <w:sz w:val="21"/>
+        </w:rPr>
+        <w:t>-ზე ავტომატურად ითიშება/უქმდება მოქმედების ვადის ამოწურვის საფუძველზე (წესის მე-12 მუხლის მე-2 პუნქტისა და მე-10 მუხლის 1-ლი პუნქტის „ვ“ ქვეპუნქტის შესაბამისად);</w:t>
       </w:r>
     </w:p>
     <w:p>
@@ -1007,7 +1067,7 @@
           <w:color w:val="000000"/>
           <w:sz w:val="21"/>
         </w:rPr>
-        <w:t xml:space="preserve"> 2029 წლის 1 იანვრის შემდეგ აღნიშნულ პირთა რესერტიფიკაცია დასაშვებია მხოლოდ სტანდარტული საკვალიფიკაციო მოთხოვნების — მათ შორის, შესაბამისი აკადემიური ხარისხისა და საერთო სამუშაო გამოცდილების — სრულად დაკმაყოფილების შემთხვევაში.</w:t>
+        <w:t xml:space="preserve"> გარდამავალი ან 5-წლიანი ვადის ამოწურვის შემდეგ აღნიშნულ პირთა რესერტიფიკაცია დასაშვებია მხოლოდ რესერტიფიცირების მომენტისთვის მოქმედი საკვალიფიკაციო მოთხოვნების — მათ შორის, შესაბამისი აკადემიური ხარისხისა და სამუშაო გამოცდილების — სრულად დაკმაყოფილების შემთხვევაში.</w:t>
       </w:r>
     </w:p>
     <w:p>
@@ -7666,7 +7726,7 @@
           <w:color w:val="000000"/>
           <w:sz w:val="21"/>
         </w:rPr>
-        <w:t xml:space="preserve"> ვადით, რომელიც აითვლება მისი გაცემის თარიღიდან. გარდამავალი პირობით (§2.5 — აკადემიური ხარისხის გარეშე) გაცემული A და B კატეგორიის სერტიფიკატი მოქმედებს </w:t>
+        <w:t xml:space="preserve"> ვადით, რომელიც აითვლება მისი გაცემის თარიღიდან (№134 დადგენილებით დამტკიცებული წესის მე-2 მუხლის მე-3 პუნქტი). გარდამავალი პირობით (§2.5 — აკადემიური ხარისხის გარეშე) გაცემულ A და B კატეგორიის სერტიფიკატზე ვრცელდება §2.5 „ბ“ პუნქტითა და საგამონაკლისო ხელშეკრულებით (</w:t>
       </w:r>
       <w:r>
         <w:rPr>
@@ -7676,6 +7736,46 @@
           <w:color w:val="000000"/>
           <w:sz w:val="21"/>
         </w:rPr>
+        <w:t>GIPC-CON-001 (გარდამავალი)</w:t>
+      </w:r>
+      <w:r>
+        <w:rPr>
+          <w:rFonts w:ascii="Sylfaen" w:hAnsi="Sylfaen" w:cs="Sylfaen" w:eastAsia="Sylfaen"/>
+          <w:b w:val="0"/>
+          <w:i w:val="0"/>
+          <w:color w:val="000000"/>
+          <w:sz w:val="21"/>
+        </w:rPr>
+        <w:t xml:space="preserve"> / </w:t>
+      </w:r>
+      <w:r>
+        <w:rPr>
+          <w:rFonts w:ascii="Sylfaen" w:hAnsi="Sylfaen" w:cs="Sylfaen" w:eastAsia="Sylfaen"/>
+          <w:b/>
+          <w:i w:val="0"/>
+          <w:color w:val="000000"/>
+          <w:sz w:val="21"/>
+        </w:rPr>
+        <w:t>GIPC-CON-002 (გარდამავალი)</w:t>
+      </w:r>
+      <w:r>
+        <w:rPr>
+          <w:rFonts w:ascii="Sylfaen" w:hAnsi="Sylfaen" w:cs="Sylfaen" w:eastAsia="Sylfaen"/>
+          <w:b w:val="0"/>
+          <w:i w:val="0"/>
+          <w:color w:val="000000"/>
+          <w:sz w:val="21"/>
+        </w:rPr>
+        <w:t xml:space="preserve">) განსაზღვრული ორმაგი ვადის დათქმა (დიპლომის წარუდგენლობისას მოქმედებს </w:t>
+      </w:r>
+      <w:r>
+        <w:rPr>
+          <w:rFonts w:ascii="Sylfaen" w:hAnsi="Sylfaen" w:cs="Sylfaen" w:eastAsia="Sylfaen"/>
+          <w:b/>
+          <w:i w:val="0"/>
+          <w:color w:val="000000"/>
+          <w:sz w:val="21"/>
+        </w:rPr>
         <w:t>2029 წლის 1 იანვრამდე</w:t>
       </w:r>
       <w:r>
@@ -7686,7 +7786,7 @@
           <w:color w:val="000000"/>
           <w:sz w:val="21"/>
         </w:rPr>
-        <w:t>. კანონმდებლობის არსებითი ცვლილებით გამოწვეული ვადამდელი რესერტიფიცირების შემთხვევაში განახლებული სერტიფიკატი მოქმედებს თავდაპირველი სერტიფიკატის დარჩენილი ვადით.</w:t>
+        <w:t xml:space="preserve"> ან კანონმდებლობით გადაწეულ ახალ გარდამავალ თარიღამდე, მაგრამ არაუმეტეს გაცემიდან 5 წლისა, ხოლო გარდამავალ ვადაში დიპლომის წარდგენისას — სრული 5-წლიანი ვადით). კანონმდებლობის არსებითი ცვლილებით გამოწვეული ვადამდელი რესერტიფიცირების შემთხვევაში განახლებული სერტიფიკატი მოქმედებს თავდაპირველი სერტიფიკატის დარჩენილი ვადით.</w:t>
       </w:r>
     </w:p>
     <w:p>
@@ -8213,7 +8313,7 @@
           <w:color w:val="000000"/>
           <w:sz w:val="21"/>
         </w:rPr>
-        <w:t>ვ) სერტიფიკატის მოქმედების ვადის ამოწურვა.</w:t>
+        <w:t>ვ) სერტიფიკატის მოქმედების ვადის ამოწურვა (მათ შორის, §2.5-ის გარდამავალი დებულებით გაცემულ სერტიფიკატზე დიპლომის წარუდგენლობის შემთხვევაში — საგამონაკლისო/გარდამავალი ვადის ამოწურვა).</w:t>
       </w:r>
     </w:p>
     <w:p>
@@ -8505,7 +8605,7 @@
           <w:color w:val="000000"/>
           <w:sz w:val="21"/>
         </w:rPr>
-        <w:t>ა) რესერტიფიცირების 5-წლიანი პერიოდი (ხოლო §2.5-ით გათვალისწინებულ გარდამავალ შემთხვევაში — 2029 წლის 1 იანვრამდე პერიოდი) ეფუძნება საქართველოს მთავრობის №134 დადგენილებით განსაზღვრულ სერტიფიკატის მოქმედების ვადას;</w:t>
+        <w:t>ა) რესერტიფიცირების 5-წლიანი პერიოდი (ხოლო §2.5-ით გათვალისწინებულ გარდამავალ შემთხვევაში — §2.5 „ბ“ პუნქტით განსაზღვრული ორმაგი ვადის დათქმის შესაბამისი პერიოდი) ეფუძნება საქართველოს მთავრობის №134 დადგენილებით განსაზღვრულ სერტიფიკატის მოქმედების ვადას;</w:t>
       </w:r>
     </w:p>
     <w:p>
@@ -9008,27 +9108,7 @@
           <w:color w:val="000000"/>
           <w:sz w:val="21"/>
         </w:rPr>
-        <w:t xml:space="preserve"> (ან </w:t>
-      </w:r>
-      <w:r>
-        <w:rPr>
-          <w:rFonts w:ascii="Sylfaen" w:hAnsi="Sylfaen" w:cs="Sylfaen" w:eastAsia="Sylfaen"/>
-          <w:b/>
-          <w:i w:val="0"/>
-          <w:color w:val="000000"/>
-          <w:sz w:val="21"/>
-        </w:rPr>
-        <w:t>2029 წლის 1 იანვრამდე</w:t>
-      </w:r>
-      <w:r>
-        <w:rPr>
-          <w:rFonts w:ascii="Sylfaen" w:hAnsi="Sylfaen" w:cs="Sylfaen" w:eastAsia="Sylfaen"/>
-          <w:b w:val="0"/>
-          <w:i w:val="0"/>
-          <w:color w:val="000000"/>
-          <w:sz w:val="21"/>
-        </w:rPr>
-        <w:t xml:space="preserve"> — §2.5-ით გათვალისწინებული გარდამავალი დებულებით სარგებლობისას). თუ A კატეგორიის მქონე პირი B ან C კატეგორიაზე გადასასვლელ გამოცდაზე ვერ გადალახავს 75%-იან ზღვარს (ან გადააჭარბებს არასწორი მონიშვნების ლიმიტს), მისი მოქმედი A კატეგორიის სერტიფიკატი უცვლელად რჩება ძალაში.</w:t>
+        <w:t xml:space="preserve"> (ხოლო §2.5-ით გათვალისწინებული გარდამავალი დებულებით სარგებლობისას — §2.5 „ბ“ პუნქტის ორმაგი ვადის დათქმით). თუ A კატეგორიის მქონე პირი B ან C კატეგორიაზე გადასასვლელ გამოცდაზე ვერ გადალახავს 75%-იან ზღვარს (ან გადააჭარბებს არასწორი მონიშვნების ლიმიტს), მისი მოქმედი A კატეგორიის სერტიფიკატი უცვლელად რჩება ძალაში.</w:t>
       </w:r>
     </w:p>
     <w:p>
@@ -9061,7 +9141,7 @@
           <w:color w:val="000000"/>
           <w:sz w:val="21"/>
         </w:rPr>
-        <w:t>2029 წლის 1 იანვრამდე გარდამავალი პირობით (აკადემიური ხარისხის გარეშე) გაცემული A და B კატეგორიის სერტიფიკატების განახლება 2029 წლის 1 იანვრის შემდეგ შესაძლებელია მხოლოდ სტანდარტული საკვალიფიკაციო მოთხოვნების (უმაღლესი არქიტექტურული განათლება, სპეციალობით მუშაობის 3-წლიანი საერთო და ბოლო 2 წლის უწყვეტი გამოცდილება) სრულად დაკმაყოფილებისა და გამოცდის ჩაბარების საფუძველზე.</w:t>
+        <w:t>გარდამავალი პირობით (აკადემიური ხარისხის გარეშე) გაცემული A და B კატეგორიის სერტიფიკატების რესერტიფიცირება სერტიფიკატის მოქმედების ვადის ამოწურვის შემდეგ შესაძლებელია მხოლოდ რესერტიფიცირების მომენტისთვის მოქმედი სტანდარტული საკვალიფიკაციო მოთხოვნების (უმაღლესი არქიტექტურული განათლება, სპეციალობით მუშაობის 3-წლიანი საერთო და ბოლო 2 წლის უწყვეტი გამოცდილება) სრულად დაკმაყოფილებისა და გამოცდის ჩაბარების საფუძველზე.</w:t>
       </w:r>
     </w:p>
     <w:p>

</xml_diff>

<commit_message>
Update contract assembly (single category/regime, director details, blank public template) and certificate letter template
</commit_message>
<xml_diff>
--- a/backend/app/data/contracts/01_სერტიფიკაციის_სქემა.docx
+++ b/backend/app/data/contracts/01_სერტიფიკაციის_სქემა.docx
@@ -7304,7 +7304,47 @@
           <w:color w:val="000000"/>
           <w:sz w:val="21"/>
         </w:rPr>
-        <w:t>), რითაც იურიდიულ ძალაში შედის გამოცდის დღეს ხელმოწერილი ერთიანი ხელშეკრულების სასერტიფიკაციო ნაწილი (1-თვიანი ვადის გასვლის შემთხვევაში საგამოცდო შედეგი ძალას კარგავს და სერტიფიკატის მისაღებად საჭიროა გამოცდის ხელახლა ჩაბარება; ამასთან, დადგენილ ვადაში საგამოცდო შედეგზე აპელაციის წარდგენა აჩერებს აღნიშნული 1-თვიანი ვადის დინებას აპელაციაზე საბოლოო გადაწყვეტილების ოფიციალურ შეტყობინებამდე).</w:t>
+        <w:t xml:space="preserve">), რითაც იურიდიულ ძალაში შედის გამოცდის დღეს ხელმოწერილი ერთიანი ხელშეკრულების სასერტიფიკაციო ნაწილი, და ვებგვერდზე, </w:t>
+      </w:r>
+      <w:r>
+        <w:rPr>
+          <w:rFonts w:ascii="Sylfaen" w:hAnsi="Sylfaen" w:cs="Sylfaen" w:eastAsia="Sylfaen"/>
+          <w:b/>
+          <w:i w:val="0"/>
+          <w:color w:val="000000"/>
+          <w:sz w:val="21"/>
+        </w:rPr>
+        <w:t>„განცხადებების“</w:t>
+      </w:r>
+      <w:r>
+        <w:rPr>
+          <w:rFonts w:ascii="Sylfaen" w:hAnsi="Sylfaen" w:cs="Sylfaen" w:eastAsia="Sylfaen"/>
+          <w:b w:val="0"/>
+          <w:i w:val="0"/>
+          <w:color w:val="000000"/>
+          <w:sz w:val="21"/>
+        </w:rPr>
+        <w:t xml:space="preserve"> განყოფილებიდან (</w:t>
+      </w:r>
+      <w:r>
+        <w:rPr>
+          <w:rFonts w:ascii="Sylfaen" w:hAnsi="Sylfaen" w:cs="Sylfaen" w:eastAsia="Sylfaen"/>
+          <w:b/>
+          <w:i w:val="0"/>
+          <w:color w:val="000000"/>
+          <w:sz w:val="21"/>
+        </w:rPr>
+        <w:t>„სხვა განაცხადი“</w:t>
+      </w:r>
+      <w:r>
+        <w:rPr>
+          <w:rFonts w:ascii="Sylfaen" w:hAnsi="Sylfaen" w:cs="Sylfaen" w:eastAsia="Sylfaen"/>
+          <w:b w:val="0"/>
+          <w:i w:val="0"/>
+          <w:color w:val="000000"/>
+          <w:sz w:val="21"/>
+        </w:rPr>
+        <w:t>) აგზავნის შეტყობინებას თანხის ჩარიცხვის შესახებ საგადახდო ქვითრის დართვით (1-თვიანი ვადის გასვლის შემთხვევაში საგამოცდო შედეგი ძალას კარგავს და სერტიფიკატის მისაღებად საჭიროა გამოცდის ხელახლა ჩაბარება; ამასთან, დადგენილ ვადაში საგამოცდო შედეგზე აპელაციის წარდგენა აჩერებს აღნიშნული 1-თვიანი ვადის დინებას აპელაციაზე საბოლოო გადაწყვეტილების ოფიციალურ შეტყობინებამდე).</w:t>
       </w:r>
     </w:p>
     <w:p>
@@ -7340,7 +7380,7 @@
           <w:color w:val="000000"/>
           <w:sz w:val="21"/>
         </w:rPr>
-        <w:t xml:space="preserve"> სერტიფიკატის გაცემის საფასურის (3 000 ლარის) გადახდიდან არაუმეტეს </w:t>
+        <w:t xml:space="preserve"> სერტიფიკატის გაცემის საფასურის (3 000 ლარის) სრულად ჩარიცხვიდან და საგადახდო ქვითრის გამოგზავნიდან არაუმეტეს </w:t>
       </w:r>
       <w:r>
         <w:rPr>

</xml_diff>

<commit_message>
Integrate doc 4 accreditation package and add 11-digit personal_id search in public registry
</commit_message>
<xml_diff>
--- a/backend/app/data/contracts/01_სერტიფიკაციის_სქემა.docx
+++ b/backend/app/data/contracts/01_სერტიფიკაციის_სქემა.docx
@@ -915,7 +915,7 @@
           <w:color w:val="000000"/>
           <w:sz w:val="21"/>
         </w:rPr>
-        <w:t xml:space="preserve"> გარდამავალი წესით (უმაღლესი არქიტექტურული განათლების დიპლომის წარმოდგენის გარეშე) სერტიფიცირებულ პირზე გაიცემა სტანდარტული ფორმის სერტიფიკატი (5-წლიანი სასერტიფიკაციო ციკლით — წესის მე-2 მუხლის მე-3 პუნქტი) ერთიანი საგამოცდო და სასერტიფიკაციო ხელშეკრულებით განსაზღვრული იმ სავალდებულო სახელშეკრულებო პირობით, რომ პირი კანონმდებლობით დადგენილი გარდამავალი ვადის (</w:t>
+        <w:t xml:space="preserve"> გარდამავალი წესით (უმაღლესი არქიტექტურული განათლების დიპლომის წარმოდგენის გარეშე) სერტიფიცირებულ პირზე გაიცემა სტანდარტული ფორმის სერტიფიკატი (5-წლიანი სასერტიფიკაციო ციკლით — წესის მე-2 მუხლის მე-3 პუნქტი) ერთიანი საგამოცდო და სასერტიფიკაციო ხელშეკრულებით განსაზღვრული ორმაგი ვადის დათქმით: თუ პირი კანონმდებლობით დადგენილი გარდამავალი ვადის (</w:t>
       </w:r>
       <w:r>
         <w:rPr>
@@ -935,7 +935,7 @@
           <w:color w:val="000000"/>
           <w:sz w:val="21"/>
         </w:rPr>
-        <w:t xml:space="preserve">, ხოლო სახელმწიფოს მიერ ვადის ოფიციალურად გადაწევის შემთხვევაში — შესაბამისი ნორმატიული აქტით/გარდამავალი დებულებით განსაზღვრული ახალი საკანონმდებლო თარიღი) ამოწურვამდე წარადგენს უმაღლესი არქიტექტურული განათლების დიპლომს. გარდამავალ ვადამდე დიპლომის წარდგენისა და სტანდარტული რეჟიმის წინაპირობებთან (§4.1, მოქმედი კანონმდებლობის მოთხოვნათა გათვალისწინებით) შესაბამისობის დოკუმენტური დადასტურების (სერტიფიცირების გადაწყვეტილების განახლების) საფუძველზე სერტიფიკატს ეხსნება საგამონაკლისო შეზღუდვა და იგი უწყვეტად აგრძელებს მოქმედებას თავდაპირველი 5-წლიანი სასერტიფიკაციო ციკლის ამოწურვამდე (დამატებითი გამოცდისა და საფასურის გარეშე), ხოლო დიპლომის წარუდგენლობის შემთხვევაში გარდამავალი თარიღის დადგომისთანავე იწურება სერტიფიკატის მოქმედების საგამონაკლისო ვადა და სერტიფიკატი </w:t>
+        <w:t xml:space="preserve">, ხოლო სახელმწიფოს მიერ ვადის ოფიციალურად გადაწევის შემთხვევაში — შესაბამისი ნორმატიული აქტით/გარდამავალი დებულებით განსაზღვრული ახალი საკანონმდებლო თარიღი) ამოწურვამდე წარადგენს უმაღლესი არქიტექტურული განათლების დიპლომს და დოკუმენტურად დადასტურდება სტანდარტული რეჟიმის წინაპირობებთან (§4.1, მოქმედი კანონმდებლობის მოთხოვნათა გათვალისწინებით) შესაბამისობა (სერტიფიცირების გადაწყვეტილების განახლებით), სერტიფიკატს ეხსნება საგამონაკლისო შეზღუდვა და იგი უწყვეტად აგრძელებს მოქმედებას თავდაპირველი 5-წლიანი სასერტიფიკაციო ციკლის ამოწურვამდე (დამატებითი გამოცდისა და საფასურის გარეშე), ხოლო დიპლომის წარუდგენლობის შემთხვევაში გარდამავალი თარიღის დადგომისთანავე იწურება სერტიფიკატის მოქმედების საგამონაკლისო ვადა და სერტიფიკატი </w:t>
       </w:r>
       <w:r>
         <w:rPr>
@@ -6556,67 +6556,7 @@
           <w:color w:val="000000"/>
           <w:sz w:val="21"/>
         </w:rPr>
-        <w:t xml:space="preserve">ბ) თუ კანდიდატს განაცხადით მოთხოვნილი ჰქონდა </w:t>
-      </w:r>
-      <w:r>
-        <w:rPr>
-          <w:rFonts w:ascii="Sylfaen" w:hAnsi="Sylfaen" w:cs="Sylfaen" w:eastAsia="Sylfaen"/>
-          <w:b/>
-          <w:i w:val="0"/>
-          <w:color w:val="000000"/>
-          <w:sz w:val="21"/>
-        </w:rPr>
-        <w:t>B</w:t>
-      </w:r>
-      <w:r>
-        <w:rPr>
-          <w:rFonts w:ascii="Sylfaen" w:hAnsi="Sylfaen" w:cs="Sylfaen" w:eastAsia="Sylfaen"/>
-          <w:b w:val="0"/>
-          <w:i w:val="0"/>
-          <w:color w:val="000000"/>
-          <w:sz w:val="21"/>
-        </w:rPr>
-        <w:t xml:space="preserve"> ან </w:t>
-      </w:r>
-      <w:r>
-        <w:rPr>
-          <w:rFonts w:ascii="Sylfaen" w:hAnsi="Sylfaen" w:cs="Sylfaen" w:eastAsia="Sylfaen"/>
-          <w:b/>
-          <w:i w:val="0"/>
-          <w:color w:val="000000"/>
-          <w:sz w:val="21"/>
-        </w:rPr>
-        <w:t>C</w:t>
-      </w:r>
-      <w:r>
-        <w:rPr>
-          <w:rFonts w:ascii="Sylfaen" w:hAnsi="Sylfaen" w:cs="Sylfaen" w:eastAsia="Sylfaen"/>
-          <w:b w:val="0"/>
-          <w:i w:val="0"/>
-          <w:color w:val="000000"/>
-          <w:sz w:val="21"/>
-        </w:rPr>
-        <w:t xml:space="preserve"> კატეგორია, მაგრამ გამოცდაზე ვერ გადალახა 75%-იანი ბარიერი, თუმცა გადალახა </w:t>
-      </w:r>
-      <w:r>
-        <w:rPr>
-          <w:rFonts w:ascii="Sylfaen" w:hAnsi="Sylfaen" w:cs="Sylfaen" w:eastAsia="Sylfaen"/>
-          <w:b/>
-          <w:i w:val="0"/>
-          <w:color w:val="000000"/>
-          <w:sz w:val="21"/>
-        </w:rPr>
-        <w:t>A კატეგორიის 70%-იანი ბარიერი</w:t>
-      </w:r>
-      <w:r>
-        <w:rPr>
-          <w:rFonts w:ascii="Sylfaen" w:hAnsi="Sylfaen" w:cs="Sylfaen" w:eastAsia="Sylfaen"/>
-          <w:b w:val="0"/>
-          <w:i w:val="0"/>
-          <w:color w:val="000000"/>
-          <w:sz w:val="21"/>
-        </w:rPr>
-        <w:t xml:space="preserve"> — განაცხადში დაფიქსირებული წინასწარი თანხმობის საფუძველზე მას ეძლევა </w:t>
+        <w:t xml:space="preserve">ბ) თუ კანდიდატს განაცხადში მონიშნული აქვს სათადარიგო A კატეგორია და ვერ დააკმაყოფილა B ან C კატეგორიის მოთხოვნები, მაგრამ აკმაყოფილებს A კატეგორიის პირობებსა და საგამოცდო ბარიერს (≥70%) — მას ეძლევა </w:t>
       </w:r>
       <w:r>
         <w:rPr>
@@ -7060,7 +7000,7 @@
           <w:color w:val="000000"/>
           <w:sz w:val="21"/>
         </w:rPr>
-        <w:t xml:space="preserve"> ვადაში ამოწმებს წარდგენილი დოკუმენტების სისრულესა და საკვალიფიკაციო მოთხოვნებთან შესაბამისობას. თუ წარდგენილი დოკუმენტაცია არასრულია ან ხარვეზიანია, ინსტიტუტი კანდიდატს ხარვეზის აღმოსაფხვრელად განუსაზღვრავს გონივრულ ვადას (</w:t>
+        <w:t xml:space="preserve"> ვადაში ამოწმებს წარდგენილი დოკუმენტების სისრულესა და საკვალიფიკაციო მოთხოვნებთან შესაბამისობას. თუ წარმოდგენილი დოკუმენტაცია სრულია და ადასტურებს საკვალიფიკაციო მოთხოვნებთან შესაბამისობას — კანდიდატი დაიშვება გამოცდაზე, ენიშნება საგამოცდო სესიის თარიღი/დრო და ეცნობება საფასურის გადახდის რეკვიზიტები. თუ წარმოდგენილი დოკუმენტაცია არასრულია, არ ადასტურებს საკვალიფიკაციო წინაპირობებთან შესაბამისობას ან შეიცავს მცდარ მონაცემებს, განაცხადი არ კმაყოფილდება (კანდიდატი არ დაიშვება გამოცდაზე) და კანდიდატს ეგზავნება დასაბუთებული წერილობითი შეტყობინება კონკრეტული საფუძვლის/ხარვეზისა და გასაჩივრების წესის მითითებით, რომლითაც კანდიდატს ეძლევა გონივრული ვადა ხარვეზის აღმოსაფხვრელად და ვებგვერდზე (</w:t>
       </w:r>
       <w:r>
         <w:rPr>
@@ -7070,7 +7010,7 @@
           <w:color w:val="000000"/>
           <w:sz w:val="21"/>
         </w:rPr>
-        <w:t>5 სამუშაო დღეს</w:t>
+        <w:t>gipc.org.ge</w:t>
       </w:r>
       <w:r>
         <w:rPr>
@@ -7080,7 +7020,7 @@
           <w:color w:val="000000"/>
           <w:sz w:val="21"/>
         </w:rPr>
-        <w:t xml:space="preserve"> — №134 დადგენილების მე-4 მუხლის მე-7 პუნქტი); დადგენილ ვადაში ხარვეზის აღმოუფხვრელობა, საკვალიფიკაციო წინაპირობების დაუკმაყოფილებლობა ან მცდარი ინფორმაციის წარდგენა განაცხადის უარყოფის (გამოცდაზე არდაშვების) საფუძველია (№134 დადგენილების მე-4 მუხლის მე-6 და მე-7 პუნქტები). გამოცდაზე დაშვების დადასტურების შემდეგ კანდიდატს ეცნობება გამოცდის თარიღი, დრო და საფასურის გადახდის რეკვიზიტები.</w:t>
+        <w:t>) განაცხადის ხელახლა წარდგენის გზით დოკუმენტაციის სრულყოფილად წარსადგენად.</w:t>
       </w:r>
     </w:p>
     <w:p>
@@ -7380,7 +7320,7 @@
           <w:color w:val="000000"/>
           <w:sz w:val="21"/>
         </w:rPr>
-        <w:t xml:space="preserve"> სერტიფიკატის გაცემის საფასურის (3 000 ლარის) სრულად ჩარიცხვიდან და საგადახდო ქვითრის გამოგზავნიდან არაუმეტეს </w:t>
+        <w:t xml:space="preserve"> სერტიფიკატის გაცემის საფასურის (3 000 ლარის) სრულად გადახდიდან (ჩარიცხვიდან), გადახდის შესახებ შეტყობინებისა და საგადახდო ქვითრის გამოგზავნიდან არაუმეტეს </w:t>
       </w:r>
       <w:r>
         <w:rPr>
@@ -7493,7 +7433,7 @@
           <w:color w:val="000000"/>
           <w:sz w:val="21"/>
         </w:rPr>
-        <w:t xml:space="preserve">) აისახება სერტიფიკატის გაცემის საფასურის (3 000 ლარის) გადახდიდან არაუმეტეს </w:t>
+        <w:t xml:space="preserve">) აისახება სერტიფიკატის გაცემის საფასურის (3 000 ლარის) სრულად გადახდიდან (ჩარიცხვიდან), გადახდის შესახებ შეტყობინებისა და საგადახდო ქვითრის გამოგზავნიდან არაუმეტეს </w:t>
       </w:r>
       <w:r>
         <w:rPr>
@@ -7851,7 +7791,7 @@
           <w:color w:val="000000"/>
           <w:sz w:val="21"/>
         </w:rPr>
-        <w:t>საჯარო რეესტრში (საქართველოს მთავრობის №134 დადგენილებით დამტკიცებული წესის მე-2 მუხლის მე-5 და მე-6 პუნქტებისა და ერთიანი ხელშეკრულების) ქვეყნდება სერტიფიცირებული პირის სახელი, გვარი, ელფოსტა, რეგისტრაციის დრო, სერტიფიკატის უნიკალური კოდი, კვალიფიკაცია (კატეგორია და სფერო / სქემის იდენტიფიკაცია), მოქმედი პირობები და შეზღუდვები (ასეთის არსებობისას), სერტიფიკატის სტატუსი (მოქმედი, შეჩერებული, გაუქმებული / ვადაგასული), გაცემის თარიღი, ვადა (წელი) და მოქმედების ბოლო თარიღი, აგრეთვე ჩამოსატვირთი სახით თავად გაცემული სერტიფიკატი (რომელზეც მითითებულია მფლობელის პირადი ნომერი). სერტიფიცირებული პირის ტელეფონის ნომერი, საგამოცდო ქულები და პირადი საქმის დოკუმენტები საჯაროდ არ ქვეყნდება.</w:t>
+        <w:t>საჯარო რეესტრში ქვეყნდება სერტიფიცირებული პირის სახელი, გვარი, პირადი ნომერი, ელფოსტა, რეგისტრაციის დრო, სერტიფიკატის უნიკალური კოდი, კვალიფიკაცია (კატეგორია და სფერო), გაცემის თარიღი, მოქმედების ვადა, მოქმედების ბოლო თარიღი, სერტიფიკატის სტატუსი (მოქმედი, შეჩერებული, გაუქმებული, ვადაგასული), შესაბამისი პირობები/შეზღუდვები (ასეთის არსებობისას) და გაცემული სერტიფიკატი. სერტიფიცირებული პირის ტელეფონის ნომერი, საგამოცდო ქულები და პირადი საქმის დოკუმენტები საჯაროდ არ ქვეყნდება.</w:t>
       </w:r>
     </w:p>
     <w:p>
@@ -8074,7 +8014,7 @@
           <w:color w:val="000000"/>
           <w:sz w:val="21"/>
         </w:rPr>
-        <w:t xml:space="preserve"> ვადაში განაახლებს სტატუსს საჯარო რეესტრში და უგზავნის პირს შეტყობინებას. თუ დადგენილ ვადაში შეჩერების საფუძველი არ აღმოიფხვრა, სერტიფიკატი უქმდება.</w:t>
+        <w:t xml:space="preserve"> ვადაში განაახლებს სტატუსს საჯარო რეესტრში და უგზავნის პირს შეტყობინებას. თუ შეჩერების პერიოდში სერტიფიკატს ამოეწურა მოქმედების ვადა, აღდგენის ნაცვლად გამოიყენება რესერტიფიცირების წესი (§10).</w:t>
       </w:r>
     </w:p>
     <w:p>
@@ -9174,7 +9114,7 @@
           <w:color w:val="000000"/>
           <w:sz w:val="21"/>
         </w:rPr>
-        <w:t xml:space="preserve">სერტიფიცირების სქემა შიდა წესით (მენეჯმენტის მიმოხილვის ფარგლებში) განიხილება სულ მცირე </w:t>
+        <w:t xml:space="preserve">საგამოცდო კითხვებისა და პროექტების ბაზის მიმდინარე მომზადებას, ცვლილებასა და განახლებას დამოუკიდებლად ახორციელებს საგამოცდო მენეჯერი. სერტიფიცირების სქემა შიდა წესით (მენეჯმენტის მიმოხილვის ფარგლებში) განიხილება სულ მცირე </w:t>
       </w:r>
       <w:r>
         <w:rPr>
@@ -9194,7 +9134,7 @@
           <w:color w:val="000000"/>
           <w:sz w:val="21"/>
         </w:rPr>
-        <w:t xml:space="preserve">, ხოლო დამოუკიდებელი მოწვეული დარგობრივი ექსპერტის (ან საჭიროების შემთხვევაში — ექსპერტთა ჯგუფის) მონაწილეობით სქემისა და საგამოცდო ბაზის ტექნიკური გადახედვა და ვალიდაცია ტარდება </w:t>
+        <w:t xml:space="preserve">, ხოლო დამოუკიდებელი მოწვეული დარგობრივი ექსპერტის (ან საჭიროების შემთხვევაში — ექსპერტთა ჯგუფის) მონაწილეობით სქემისა და საგამოცდო ბაზის პერიოდული ტექნიკური გადახედვა და ვალიდაცია ტარდება </w:t>
       </w:r>
       <w:r>
         <w:rPr>
@@ -9204,7 +9144,7 @@
           <w:color w:val="000000"/>
           <w:sz w:val="21"/>
         </w:rPr>
-        <w:t>საჭიროების შემთხვევაში</w:t>
+        <w:t>სულ მცირე 3 წელიწადში ერთხელ</w:t>
       </w:r>
       <w:r>
         <w:rPr>
@@ -9214,27 +9154,7 @@
           <w:color w:val="000000"/>
           <w:sz w:val="21"/>
         </w:rPr>
-        <w:t xml:space="preserve"> (საკანონმდებლო ცვლილების, ხარვეზის ან კომპრომეტირების დროს), აგრეთვე </w:t>
-      </w:r>
-      <w:r>
-        <w:rPr>
-          <w:rFonts w:ascii="Sylfaen" w:hAnsi="Sylfaen" w:cs="Sylfaen" w:eastAsia="Sylfaen"/>
-          <w:b/>
-          <w:i w:val="0"/>
-          <w:color w:val="000000"/>
-          <w:sz w:val="21"/>
-        </w:rPr>
-        <w:t>პერიოდულად — სულ მცირე 3 წელიწადში ერთხელ</w:t>
-      </w:r>
-      <w:r>
-        <w:rPr>
-          <w:rFonts w:ascii="Sylfaen" w:hAnsi="Sylfaen" w:cs="Sylfaen" w:eastAsia="Sylfaen"/>
-          <w:b w:val="0"/>
-          <w:i w:val="0"/>
-          <w:color w:val="000000"/>
-          <w:sz w:val="21"/>
-        </w:rPr>
-        <w:t>, შემდეგი მიზნით:</w:t>
+        <w:t xml:space="preserve"> (აგრეთვე საჭიროების შემთხვევაში — არსებითი საკანონმდებლო ცვლილების დროს), შემდეგი მიზნით:</w:t>
       </w:r>
     </w:p>
     <w:p>

</xml_diff>